<commit_message>
Document Ubuntu 22.04 compatibility downloads for 2.3.1
</commit_message>
<xml_diff>
--- a/docs/manual/Maritime_Ship_Simulator_User_Guide_2.3.1.docx
+++ b/docs/manual/Maritime_Ship_Simulator_User_Guide_2.3.1.docx
@@ -31,7 +31,7 @@
         </w:rPr>
       </w:pPr>
       <w:r>
-        <w:t>Version 2.3.1 | User guide revision 2.1 | 26 October 2026</w:t>
+        <w:t>Version 2.3.1 | User guide revision 2.2 | 27 October 2026</w:t>
       </w:r>
     </w:p>
     <w:p>
@@ -406,7 +406,7 @@
           </w:tcPr>
           <w:p>
             <w:r>
-              <w:t>User guide 2.1</w:t>
+              <w:t>User guide 2.2</w:t>
             </w:r>
           </w:p>
         </w:tc>
@@ -4216,19 +4216,8 @@
             <w:vAlign w:val="center"/>
           </w:tcPr>
           <w:p>
-            <w:pPr>
-              <w:keepNext/>
-              <w:spacing w:after="40"/>
-              <w:rPr>
-                <w:lang w:val="en-GB"/>
-              </w:rPr>
-            </w:pPr>
-            <w:r>
-              <w:rPr>
-                <w:sz w:val="17"/>
-                <w:lang w:val="en-GB"/>
-              </w:rPr>
-              <w:t>Ubuntu</w:t>
+            <w:r>
+              <w:t>Ubuntu 26.04.1</w:t>
             </w:r>
           </w:p>
         </w:tc>
@@ -4366,7 +4355,7 @@
           </w:tcPr>
           <w:p>
             <w:r>
-              <w:t>Self-build only</w:t>
+              <w:t>Compatibility DEB</w:t>
             </w:r>
           </w:p>
         </w:tc>
@@ -4384,7 +4373,7 @@
           </w:tcPr>
           <w:p>
             <w:r>
-              <w:t>No prebuilt package</w:t>
+              <w:t>AppImage or tar.gz</w:t>
             </w:r>
           </w:p>
         </w:tc>
@@ -4402,7 +4391,7 @@
           </w:tcPr>
           <w:p>
             <w:r>
-              <w:t>Build on 22.04; validate locally.</w:t>
+              <w:t>Use ubuntu-22.04-amd64 files. See checks below.</w:t>
             </w:r>
           </w:p>
         </w:tc>
@@ -4651,7 +4640,7 @@
         </w:rPr>
       </w:pPr>
       <w:r>
-        <w:t>The package declares Qt/XCB libraries, including libxcb-icccm4 and libxcb-keysyms1. Match the release's Ubuntu version and architecture. No 22.04 binary is provided; on 22.04, run bash scripts/build-v2-ubuntu-22.04.sh from the source instead.</w:t>
+        <w:t>The package declares Qt/XCB libraries, including libxcb-icccm4 and libxcb-keysyms1. On Ubuntu 22.04 use downloads labelled ubuntu-22.04-amd64. They were built and automatically checked on 22.04, then desktop-tested on Ubuntu 26.04, not a 22.04 desktop. Original downloads labelled only ubuntu target 26.04.1. Check the release page.</w:t>
       </w:r>
     </w:p>
     <w:p>
@@ -18242,7 +18231,7 @@
           </w:tcPr>
           <w:p>
             <w:r>
-              <w:t>Use a matching Ubuntu build; on 22.04 use the source build script. AppImage does not remove GLIBC requirements. Do not replace system GLIBC.</w:t>
+              <w:t>Use the ubuntu-22.04-amd64 compatibility package on 22.04. AppImage does not remove GLIBC requirements. Do not replace system GLIBC.</w:t>
             </w:r>
           </w:p>
         </w:tc>
@@ -20567,7 +20556,7 @@
         <w:color w:val="000000"/>
         <w:sz w:val="16"/>
       </w:rPr>
-      <w:t xml:space="preserve"> | User guide 2.1 | Page </w:t>
+      <w:t xml:space="preserve"> | User guide 2.2 | Page </w:t>
     </w:r>
     <w:r>
       <w:rPr>

</xml_diff>